<commit_message>
docs(portfolio): PostgreSQL·Oracle Cloud 전환을 문서·사이트·슬라이드에 반영
문서(md→docx), 소개 사이트, 발표 슬라이드의 DB·배포·테스트 수치를 096~099 기준으로
고친다. 문서에 "7.5 SQLite → PostgreSQL 전환" 사례를, 사이트에 배포 구조도와 전환
카드를, 슬라이드에 "운영 준비" 한 장을 추가한다. 사이트의 모든 코드 블록이 줄바꿈 없이
뭉쳐 보이던 기존 CSS 버그와, docx 에서 굵게 안의 인라인 코드 백틱이 그대로 찍히던
변환기 버그도 고친다.

상세 기록: docs/commits/100-portfolio-postgres-oracle.md

Co-Authored-By: Claude Opus 5.5 <noreply@anthropic.com>
</commit_message>
<xml_diff>
--- a/portfolio/VidShare-포트폴리오.docx
+++ b/portfolio/VidShare-포트폴리오.docx
@@ -354,7 +354,7 @@
                 <w:color w:val="1A1D24"/>
                 <w:sz w:val="19"/>
               </w:rPr>
-              <w:t>2026-08-14 ~ 2026-09-07 (약 3.5주)</w:t>
+              <w:t>2026-08-14 ~ 2026-10-02 (기능 3.5주 + PostgreSQL 전환·배포 준비)</w:t>
             </w:r>
           </w:p>
         </w:tc>
@@ -447,7 +447,7 @@
                 <w:color w:val="1A1D24"/>
                 <w:sz w:val="19"/>
               </w:rPr>
-              <w:t xml:space="preserve"> 브랜치, 커밋 162건 — 커밋마다 상세 기록 문서 동반</w:t>
+              <w:t xml:space="preserve"> 브랜치, 커밋 177건 — 커밋마다 상세 기록 문서 동반 · GitHub Actions CI</w:t>
             </w:r>
           </w:p>
         </w:tc>
@@ -769,7 +769,7 @@
                 <w:color w:val="1A1D24"/>
                 <w:sz w:val="19"/>
               </w:rPr>
-              <w:t>163개 파일, 약 15,700줄</w:t>
+              <w:t>169개 파일, 약 16,100줄 (테스트·스크립트 제외)</w:t>
             </w:r>
           </w:p>
         </w:tc>
@@ -895,7 +895,7 @@
                 <w:color w:val="1A1D24"/>
                 <w:sz w:val="19"/>
               </w:rPr>
-              <w:t>22개</w:t>
+              <w:t>22개 (PostgreSQL 16, 버전 관리 마이그레이션)</w:t>
             </w:r>
           </w:p>
         </w:tc>
@@ -937,7 +937,7 @@
                 <w:color w:val="1A1D24"/>
                 <w:sz w:val="19"/>
               </w:rPr>
-              <w:t>177건 (백엔드 137 · 프론트 32 · E2E 8 시나리오)</w:t>
+              <w:t>188건 (백엔드 148 · 프론트 32 · E2E 8 시나리오) — E2E 외 180건은 CI 에서 자동 실행</w:t>
             </w:r>
           </w:p>
         </w:tc>
@@ -979,7 +979,7 @@
                 <w:color w:val="1A1D24"/>
                 <w:sz w:val="19"/>
               </w:rPr>
-              <w:t>아키텍처 · 배포 · 보안 · 로드맵 + 커밋 상세 92편</w:t>
+              <w:t>아키텍처 · 배포 · 운영 절차서 · 보안 · 로드맵 + 커밋 상세 100편</w:t>
             </w:r>
           </w:p>
         </w:tc>
@@ -1393,7 +1393,7 @@
                 <w:color w:val="1A1D24"/>
                 <w:sz w:val="19"/>
               </w:rPr>
-              <w:t>SQLite (</w:t>
+              <w:t>PostgreSQL 16 (</w:t>
             </w:r>
             <w:r>
               <w:rPr>
@@ -1402,7 +1402,7 @@
                 <w:color w:val="223355"/>
                 <w:sz w:val="18"/>
               </w:rPr>
-              <w:t>better-sqlite3</w:t>
+              <w:t>pg</w:t>
             </w:r>
             <w:r>
               <w:rPr>
@@ -1431,7 +1431,25 @@
                 <w:color w:val="1A1D24"/>
                 <w:sz w:val="19"/>
               </w:rPr>
-              <w:t>설치 없이 영속화. 동기 API라 트랜잭션 코드가 단순</w:t>
+              <w:t xml:space="preserve">버전 관리 마이그레이션 · </w:t>
+            </w:r>
+            <w:r>
+              <w:rPr>
+                <w:rFonts w:ascii="Consolas" w:hAnsi="Consolas" w:eastAsia="Consolas"/>
+                <w:b w:val="0"/>
+                <w:color w:val="223355"/>
+                <w:sz w:val="18"/>
+              </w:rPr>
+              <w:t>pg_dump</w:t>
+            </w:r>
+            <w:r>
+              <w:rPr>
+                <w:rFonts w:ascii="맑은 고딕" w:hAnsi="맑은 고딕" w:eastAsia="맑은 고딕"/>
+                <w:b w:val="0"/>
+                <w:color w:val="1A1D24"/>
+                <w:sz w:val="19"/>
+              </w:rPr>
+              <w:t xml:space="preserve"> 백업. SQLite 로 시작해 배포 전에 전환 (7.5)</w:t>
             </w:r>
           </w:p>
         </w:tc>
@@ -1739,7 +1757,7 @@
                 <w:color w:val="1A1D24"/>
                 <w:sz w:val="19"/>
               </w:rPr>
-              <w:t xml:space="preserve"> + supertest, Playwright</w:t>
+              <w:t xml:space="preserve"> + supertest, Playwright, GitHub Actions</w:t>
             </w:r>
           </w:p>
         </w:tc>
@@ -1759,7 +1777,7 @@
                 <w:color w:val="1A1D24"/>
                 <w:sz w:val="19"/>
               </w:rPr>
-              <w:t>런타임 내장 러너로 의존성 최소화</w:t>
+              <w:t>런타임 내장 러너로 의존성 최소화. CI 는 Postgres 서비스 컨테이너</w:t>
             </w:r>
           </w:p>
         </w:tc>
@@ -1801,7 +1819,7 @@
                 <w:color w:val="1A1D24"/>
                 <w:sz w:val="19"/>
               </w:rPr>
-              <w:t>Cloudflare Workers (OpenNext), Cloudflare Tunnel</w:t>
+              <w:t>Cloudflare Workers (OpenNext) · Oracle Cloud VM (Caddy + systemd)</w:t>
             </w:r>
           </w:p>
         </w:tc>
@@ -1821,7 +1839,7 @@
                 <w:color w:val="1A1D24"/>
                 <w:sz w:val="19"/>
               </w:rPr>
-              <w:t>프론트 2종은 엣지, 백엔드는 로컬 노출</w:t>
+              <w:t>프론트 2종은 엣지, 백엔드는 디스크가 붙은 VM 1대</w:t>
             </w:r>
           </w:p>
         </w:tc>
@@ -2442,7 +2460,7 @@
           <w:color w:val="223355"/>
           <w:sz w:val="20"/>
         </w:rPr>
-        <w:t xml:space="preserve">             [SQLite]  data/vidshare.sqlite  (22 tables)</w:t>
+        <w:t xml:space="preserve">             [PostgreSQL 16]  22 tables + schema_migrations</w:t>
       </w:r>
     </w:p>
     <w:p>
@@ -2458,7 +2476,7 @@
           <w:color w:val="223355"/>
           <w:sz w:val="20"/>
         </w:rPr>
-        <w:t xml:space="preserve">             [Files]   uploads/  (DB엔 /uploads/&lt;uuid&gt;.ext 경로만)</w:t>
+        <w:t xml:space="preserve">             [Files]   UPLOADS_PATH  (DB엔 /uploads/&lt;uuid&gt;.ext 경로만)</w:t>
       </w:r>
     </w:p>
     <w:p>
@@ -2566,7 +2584,25 @@
           <w:color w:val="1A1D24"/>
           <w:sz w:val="21"/>
         </w:rPr>
-        <w:t>인증이 필요한 라우트는 `requireRequestUser(req)` 로 시작한다.</w:t>
+        <w:t xml:space="preserve">인증이 필요한 라우트는 </w:t>
+      </w:r>
+      <w:r>
+        <w:rPr>
+          <w:rFonts w:ascii="Consolas" w:hAnsi="Consolas" w:eastAsia="Consolas"/>
+          <w:b/>
+          <w:color w:val="223355"/>
+          <w:sz w:val="20"/>
+        </w:rPr>
+        <w:t>requireRequestUser(req)</w:t>
+      </w:r>
+      <w:r>
+        <w:rPr>
+          <w:rFonts w:ascii="맑은 고딕" w:hAnsi="맑은 고딕" w:eastAsia="맑은 고딕"/>
+          <w:b/>
+          <w:color w:val="1A1D24"/>
+          <w:sz w:val="21"/>
+        </w:rPr>
+        <w:t xml:space="preserve"> 로 시작한다.</w:t>
       </w:r>
       <w:r>
         <w:rPr>
@@ -2591,7 +2627,25 @@
           <w:color w:val="1A1D24"/>
           <w:sz w:val="21"/>
         </w:rPr>
-        <w:t>소유자 스코프 테이블은 전부 `WHERE owner_id = ?` 로 격리한다.</w:t>
+        <w:t xml:space="preserve">소유자 스코프 테이블은 전부 </w:t>
+      </w:r>
+      <w:r>
+        <w:rPr>
+          <w:rFonts w:ascii="Consolas" w:hAnsi="Consolas" w:eastAsia="Consolas"/>
+          <w:b/>
+          <w:color w:val="223355"/>
+          <w:sz w:val="20"/>
+        </w:rPr>
+        <w:t>WHERE owner_id = ?</w:t>
+      </w:r>
+      <w:r>
+        <w:rPr>
+          <w:rFonts w:ascii="맑은 고딕" w:hAnsi="맑은 고딕" w:eastAsia="맑은 고딕"/>
+          <w:b/>
+          <w:color w:val="1A1D24"/>
+          <w:sz w:val="21"/>
+        </w:rPr>
+        <w:t xml:space="preserve"> 로 격리한다.</w:t>
       </w:r>
       <w:r>
         <w:rPr>
@@ -2616,7 +2670,43 @@
           <w:color w:val="1A1D24"/>
           <w:sz w:val="21"/>
         </w:rPr>
-        <w:t>프론트는 `lib/api.ts` 를 거치지 않고 `fetch` 하지 않는다.</w:t>
+        <w:t xml:space="preserve">프론트는 </w:t>
+      </w:r>
+      <w:r>
+        <w:rPr>
+          <w:rFonts w:ascii="Consolas" w:hAnsi="Consolas" w:eastAsia="Consolas"/>
+          <w:b/>
+          <w:color w:val="223355"/>
+          <w:sz w:val="20"/>
+        </w:rPr>
+        <w:t>lib/api.ts</w:t>
+      </w:r>
+      <w:r>
+        <w:rPr>
+          <w:rFonts w:ascii="맑은 고딕" w:hAnsi="맑은 고딕" w:eastAsia="맑은 고딕"/>
+          <w:b/>
+          <w:color w:val="1A1D24"/>
+          <w:sz w:val="21"/>
+        </w:rPr>
+        <w:t xml:space="preserve"> 를 거치지 않고 </w:t>
+      </w:r>
+      <w:r>
+        <w:rPr>
+          <w:rFonts w:ascii="Consolas" w:hAnsi="Consolas" w:eastAsia="Consolas"/>
+          <w:b/>
+          <w:color w:val="223355"/>
+          <w:sz w:val="20"/>
+        </w:rPr>
+        <w:t>fetch</w:t>
+      </w:r>
+      <w:r>
+        <w:rPr>
+          <w:rFonts w:ascii="맑은 고딕" w:hAnsi="맑은 고딕" w:eastAsia="맑은 고딕"/>
+          <w:b/>
+          <w:color w:val="1A1D24"/>
+          <w:sz w:val="21"/>
+        </w:rPr>
+        <w:t xml:space="preserve"> 하지 않는다.</w:t>
       </w:r>
       <w:r>
         <w:rPr>
@@ -2720,7 +2810,7 @@
           <w:color w:val="223355"/>
           <w:sz w:val="20"/>
         </w:rPr>
-        <w:t xml:space="preserve">  → data/store.ts  (better-sqlite3 prepared statement)</w:t>
+        <w:t xml:space="preserve">  → data/store.ts  (await getDb().all/get/run — ? 를 $1, $2 … 로 변환)</w:t>
       </w:r>
     </w:p>
     <w:p>
@@ -2736,7 +2826,7 @@
           <w:color w:val="223355"/>
           <w:sz w:val="20"/>
         </w:rPr>
-        <w:t xml:space="preserve">  → SQLite</w:t>
+        <w:t xml:space="preserve">  → PostgreSQL (pg Pool)</w:t>
       </w:r>
     </w:p>
     <w:p>
@@ -4233,12 +4323,21 @@
       </w:r>
       <w:r>
         <w:rPr>
+          <w:rFonts w:ascii="Consolas" w:hAnsi="Consolas" w:eastAsia="Consolas"/>
+          <w:b/>
+          <w:color w:val="223355"/>
+          <w:sz w:val="20"/>
+        </w:rPr>
+        <w:t>lib/api.ts</w:t>
+      </w:r>
+      <w:r>
+        <w:rPr>
           <w:rFonts w:ascii="맑은 고딕" w:hAnsi="맑은 고딕" w:eastAsia="맑은 고딕"/>
           <w:b/>
           <w:color w:val="1A1D24"/>
           <w:sz w:val="21"/>
         </w:rPr>
-        <w:t>`lib/api.ts` 단 하나의 모듈</w:t>
+        <w:t xml:space="preserve"> 단 하나의 모듈</w:t>
       </w:r>
       <w:r>
         <w:rPr>
@@ -7896,7 +7995,7 @@
           <w:color w:val="1A1D24"/>
           <w:sz w:val="21"/>
         </w:rPr>
-        <w:t>Express 4 + TypeScript 기반 REST API 서버. 데이터는 SQLite(</w:t>
+        <w:t>Express 4 + TypeScript 기반 REST API 서버. 데이터는 PostgreSQL 16 에 저장되고, 업로드 파일은 디스크(</w:t>
       </w:r>
       <w:r>
         <w:rPr>
@@ -7905,7 +8004,7 @@
           <w:color w:val="223355"/>
           <w:sz w:val="20"/>
         </w:rPr>
-        <w:t>data/vidshare.sqlite</w:t>
+        <w:t>UPLOADS_PATH</w:t>
       </w:r>
       <w:r>
         <w:rPr>
@@ -7914,25 +8013,7 @@
           <w:color w:val="1A1D24"/>
           <w:sz w:val="21"/>
         </w:rPr>
-        <w:t xml:space="preserve">)에 저장되고, 업로드 파일은 </w:t>
-      </w:r>
-      <w:r>
-        <w:rPr>
-          <w:rFonts w:ascii="Consolas" w:hAnsi="Consolas" w:eastAsia="Consolas"/>
-          <w:b w:val="0"/>
-          <w:color w:val="223355"/>
-          <w:sz w:val="20"/>
-        </w:rPr>
-        <w:t>uploads/</w:t>
-      </w:r>
-      <w:r>
-        <w:rPr>
-          <w:rFonts w:ascii="맑은 고딕" w:hAnsi="맑은 고딕" w:eastAsia="맑은 고딕"/>
-          <w:b w:val="0"/>
-          <w:color w:val="1A1D24"/>
-          <w:sz w:val="21"/>
-        </w:rPr>
-        <w:t xml:space="preserve"> 디스크에 UUID 이름으로 떨어진다. DB에는 </w:t>
+        <w:t xml:space="preserve">)에 UUID 이름으로 떨어진다. DB에는 </w:t>
       </w:r>
       <w:r>
         <w:rPr>
@@ -8323,7 +8404,7 @@
           <w:color w:val="223355"/>
           <w:sz w:val="20"/>
         </w:rPr>
-        <w:t>│   ├── client.ts           ← better-sqlite3 커넥션</w:t>
+        <w:t>│   ├── client.ts           ← pg Pool + Db 래퍼(all/get/run) + withTx</w:t>
       </w:r>
     </w:p>
     <w:p>
@@ -8339,7 +8420,7 @@
           <w:color w:val="223355"/>
           <w:sz w:val="20"/>
         </w:rPr>
-        <w:t>│   ├── schema.ts           ← CREATE TABLE 22개</w:t>
+        <w:t>│   ├── migrate.ts          ← schema_migrations 러너 (advisory lock)</w:t>
       </w:r>
     </w:p>
     <w:p>
@@ -8355,7 +8436,7 @@
           <w:color w:val="223355"/>
           <w:sz w:val="20"/>
         </w:rPr>
-        <w:t>│   └── seed.ts</w:t>
+        <w:t>│   ├── migrations/         ← 0001_init.ts (22개 테이블)</w:t>
       </w:r>
     </w:p>
     <w:p>
@@ -8371,7 +8452,7 @@
           <w:color w:val="223355"/>
           <w:sz w:val="20"/>
         </w:rPr>
-        <w:t>├── middleware/errorHandler.ts   ← HttpError → JSON 변환</w:t>
+        <w:t>│   └── seed.ts</w:t>
       </w:r>
     </w:p>
     <w:p>
@@ -8387,7 +8468,7 @@
           <w:color w:val="223355"/>
           <w:sz w:val="20"/>
         </w:rPr>
-        <w:t>├── realtime/</w:t>
+        <w:t>├── middleware/</w:t>
       </w:r>
     </w:p>
     <w:p>
@@ -8403,7 +8484,7 @@
           <w:color w:val="223355"/>
           <w:sz w:val="20"/>
         </w:rPr>
-        <w:t>│   ├── notificationBus.ts  ← 알림 SSE용 owner_id 채널 EventEmitter</w:t>
+        <w:t>│   ├── errorHandler.ts     ← HttpError → JSON 변환</w:t>
       </w:r>
     </w:p>
     <w:p>
@@ -8419,7 +8500,7 @@
           <w:color w:val="223355"/>
           <w:sz w:val="20"/>
         </w:rPr>
-        <w:t>│   ├── chatBus.ts          ← 메시지 WS용 owner_id 채널 EventEmitter</w:t>
+        <w:t>│   └── asyncRouter.ts      ← async 핸들러 실패를 next(err) 로</w:t>
       </w:r>
     </w:p>
     <w:p>
@@ -8435,7 +8516,7 @@
           <w:color w:val="223355"/>
           <w:sz w:val="20"/>
         </w:rPr>
-        <w:t>│   └── chatSocket.ts       ← /ws/conversations 업그레이드·인증·송수신</w:t>
+        <w:t>├── realtime/</w:t>
       </w:r>
     </w:p>
     <w:p>
@@ -8451,7 +8532,7 @@
           <w:color w:val="223355"/>
           <w:sz w:val="20"/>
         </w:rPr>
-        <w:t>├── routes/                 ← 19개 라우터 + admin/ 6개</w:t>
+        <w:t>│   ├── notificationBus.ts  ← 알림 SSE용 owner_id 채널 EventEmitter</w:t>
       </w:r>
     </w:p>
     <w:p>
@@ -8467,7 +8548,55 @@
           <w:color w:val="223355"/>
           <w:sz w:val="20"/>
         </w:rPr>
-        <w:t>├── scripts/create-admin.ts ← 관리자 계정 생성·승격 CLI</w:t>
+        <w:t>│   ├── chatBus.ts          ← 메시지 WS용 owner_id 채널 EventEmitter</w:t>
+      </w:r>
+    </w:p>
+    <w:p>
+      <w:pPr>
+        <w:spacing w:before="0" w:after="0"/>
+        <w:ind w:left="259"/>
+        <w:shd w:val="clear" w:fill="F4F5F8"/>
+      </w:pPr>
+      <w:r>
+        <w:rPr>
+          <w:rFonts w:ascii="Consolas" w:hAnsi="Consolas" w:eastAsia="Consolas"/>
+          <w:b w:val="0"/>
+          <w:color w:val="223355"/>
+          <w:sz w:val="20"/>
+        </w:rPr>
+        <w:t>│   └── chatSocket.ts       ← /ws/conversations 업그레이드·인증·송수신</w:t>
+      </w:r>
+    </w:p>
+    <w:p>
+      <w:pPr>
+        <w:spacing w:before="0" w:after="0"/>
+        <w:ind w:left="259"/>
+        <w:shd w:val="clear" w:fill="F4F5F8"/>
+      </w:pPr>
+      <w:r>
+        <w:rPr>
+          <w:rFonts w:ascii="Consolas" w:hAnsi="Consolas" w:eastAsia="Consolas"/>
+          <w:b w:val="0"/>
+          <w:color w:val="223355"/>
+          <w:sz w:val="20"/>
+        </w:rPr>
+        <w:t>├── routes/                 ← 19개 라우터 + admin/ 6개</w:t>
+      </w:r>
+    </w:p>
+    <w:p>
+      <w:pPr>
+        <w:spacing w:before="0" w:after="0"/>
+        <w:ind w:left="259"/>
+        <w:shd w:val="clear" w:fill="F4F5F8"/>
+      </w:pPr>
+      <w:r>
+        <w:rPr>
+          <w:rFonts w:ascii="Consolas" w:hAnsi="Consolas" w:eastAsia="Consolas"/>
+          <w:b w:val="0"/>
+          <w:color w:val="223355"/>
+          <w:sz w:val="20"/>
+        </w:rPr>
+        <w:t>├── scripts/               ← create-admin · db-migrate · migrate-sqlite-to-pg · reset-schema</w:t>
       </w:r>
     </w:p>
     <w:p>
@@ -11435,7 +11564,7 @@
                 <w:color w:val="1A1D24"/>
                 <w:sz w:val="19"/>
               </w:rPr>
-              <w:t>SQLite</w:t>
+              <w:t>DB</w:t>
             </w:r>
           </w:p>
         </w:tc>
@@ -11566,7 +11695,7 @@
                 <w:color w:val="1A1D24"/>
                 <w:sz w:val="19"/>
               </w:rPr>
-              <w:t>SQLite</w:t>
+              <w:t>DB</w:t>
             </w:r>
           </w:p>
         </w:tc>
@@ -12160,7 +12289,7 @@
           <w:color w:val="1A1D24"/>
           <w:sz w:val="21"/>
         </w:rPr>
-        <w:t xml:space="preserve">세션은 SQLite </w:t>
+        <w:t xml:space="preserve">세션은 DB </w:t>
       </w:r>
       <w:r>
         <w:rPr>
@@ -12426,7 +12555,7 @@
           <w:color w:val="223355"/>
           <w:sz w:val="20"/>
         </w:rPr>
-        <w:t>npm test        # 137건 통과 (임시 SQLite에 시드 후 supertest)</w:t>
+        <w:t>npm test        # 148건 통과 (테스트 DB 의 임시 스키마에 마이그레이션·시드 후 supertest)</w:t>
       </w:r>
     </w:p>
     <w:p>
@@ -12453,12 +12582,39 @@
     <w:p>
       <w:r>
         <w:rPr>
+          <w:rFonts w:ascii="Consolas" w:hAnsi="Consolas" w:eastAsia="Consolas"/>
+          <w:b w:val="0"/>
+          <w:color w:val="223355"/>
+          <w:sz w:val="20"/>
+        </w:rPr>
+        <w:t>node --test</w:t>
+      </w:r>
+      <w:r>
+        <w:rPr>
           <w:rFonts w:ascii="맑은 고딕" w:hAnsi="맑은 고딕" w:eastAsia="맑은 고딕"/>
           <w:b w:val="0"/>
           <w:color w:val="1A1D24"/>
           <w:sz w:val="21"/>
         </w:rPr>
-        <w:t xml:space="preserve">각 테스트는 임시 디렉터리에 새 SQLite 파일을 만들어 시드하므로, 개발 DB를 오염시키지 않고 </w:t>
+        <w:t xml:space="preserve"> 는 파일을 병렬 프로세스로 돌린다. 테스트 파일마다 </w:t>
+      </w:r>
+      <w:r>
+        <w:rPr>
+          <w:rFonts w:ascii="Consolas" w:hAnsi="Consolas" w:eastAsia="Consolas"/>
+          <w:b w:val="0"/>
+          <w:color w:val="223355"/>
+          <w:sz w:val="20"/>
+        </w:rPr>
+        <w:t>vidshare_test</w:t>
+      </w:r>
+      <w:r>
+        <w:rPr>
+          <w:rFonts w:ascii="맑은 고딕" w:hAnsi="맑은 고딕" w:eastAsia="맑은 고딕"/>
+          <w:b w:val="0"/>
+          <w:color w:val="1A1D24"/>
+          <w:sz w:val="21"/>
+        </w:rPr>
+        <w:t xml:space="preserve"> 안에 </w:t>
       </w:r>
       <w:r>
         <w:rPr>
@@ -12467,7 +12623,7 @@
           <w:color w:val="1A1D24"/>
           <w:sz w:val="21"/>
         </w:rPr>
-        <w:t>서로 독립적으로</w:t>
+        <w:t>고유 스키마</w:t>
       </w:r>
       <w:r>
         <w:rPr>
@@ -12476,7 +12632,7 @@
           <w:color w:val="1A1D24"/>
           <w:sz w:val="21"/>
         </w:rPr>
-        <w:t xml:space="preserve"> 돈다.</w:t>
+        <w:t>를 만들고 끝나면 지우므로, 개발 DB 를 건드리지 않고 서로 섞이지도 않는다.</w:t>
       </w:r>
     </w:p>
     <w:p>
@@ -12792,7 +12948,7 @@
                 <w:color w:val="1A1D24"/>
                 <w:sz w:val="19"/>
               </w:rPr>
-              <w:t>마이그레이션 체계 없음</w:t>
+              <w:t>마이그레이션 체계</w:t>
             </w:r>
           </w:p>
         </w:tc>
@@ -12807,12 +12963,30 @@
             <w:r/>
             <w:r>
               <w:rPr>
+                <w:rFonts w:ascii="맑은 고딕" w:hAnsi="맑은 고딕" w:eastAsia="맑은 고딕"/>
+                <w:b/>
+                <w:color w:val="1A1D24"/>
+                <w:sz w:val="19"/>
+              </w:rPr>
+              <w:t>해결 (096)</w:t>
+            </w:r>
+            <w:r>
+              <w:rPr>
+                <w:rFonts w:ascii="맑은 고딕" w:hAnsi="맑은 고딕" w:eastAsia="맑은 고딕"/>
+                <w:b w:val="0"/>
+                <w:color w:val="1A1D24"/>
+                <w:sz w:val="19"/>
+              </w:rPr>
+              <w:t xml:space="preserve"> — </w:t>
+            </w:r>
+            <w:r>
+              <w:rPr>
                 <w:rFonts w:ascii="Consolas" w:hAnsi="Consolas" w:eastAsia="Consolas"/>
                 <w:b w:val="0"/>
                 <w:color w:val="223355"/>
                 <w:sz w:val="18"/>
               </w:rPr>
-              <w:t>initDb()</w:t>
+              <w:t>schema_migrations</w:t>
             </w:r>
             <w:r>
               <w:rPr>
@@ -12821,25 +12995,7 @@
                 <w:color w:val="1A1D24"/>
                 <w:sz w:val="19"/>
               </w:rPr>
-              <w:t xml:space="preserve"> 에서 </w:t>
-            </w:r>
-            <w:r>
-              <w:rPr>
-                <w:rFonts w:ascii="Consolas" w:hAnsi="Consolas" w:eastAsia="Consolas"/>
-                <w:b w:val="0"/>
-                <w:color w:val="223355"/>
-                <w:sz w:val="18"/>
-              </w:rPr>
-              <w:t>ensureColumn</w:t>
-            </w:r>
-            <w:r>
-              <w:rPr>
-                <w:rFonts w:ascii="맑은 고딕" w:hAnsi="맑은 고딕" w:eastAsia="맑은 고딕"/>
-                <w:b w:val="0"/>
-                <w:color w:val="1A1D24"/>
-                <w:sz w:val="19"/>
-              </w:rPr>
-              <w:t xml:space="preserve"> 개별 처리</w:t>
+              <w:t xml:space="preserve"> 기반 버전 관리</w:t>
             </w:r>
           </w:p>
         </w:tc>
@@ -12859,7 +13015,7 @@
                 <w:color w:val="1A1D24"/>
                 <w:sz w:val="19"/>
               </w:rPr>
-              <w:t>버전 테이블 기반 마이그레이션</w:t>
+              <w:t>—</w:t>
             </w:r>
           </w:p>
         </w:tc>
@@ -12881,7 +13037,7 @@
                 <w:color w:val="1A1D24"/>
                 <w:sz w:val="19"/>
               </w:rPr>
-              <w:t>실시간 단일 프로세스 전제</w:t>
+              <w:t>컬럼 타입</w:t>
             </w:r>
           </w:p>
         </w:tc>
@@ -12896,21 +13052,12 @@
             <w:r/>
             <w:r>
               <w:rPr>
-                <w:rFonts w:ascii="Consolas" w:hAnsi="Consolas" w:eastAsia="Consolas"/>
-                <w:b w:val="0"/>
-                <w:color w:val="223355"/>
-                <w:sz w:val="18"/>
-              </w:rPr>
-              <w:t>EventEmitter</w:t>
-            </w:r>
-            <w:r>
-              <w:rPr>
                 <w:rFonts w:ascii="맑은 고딕" w:hAnsi="맑은 고딕" w:eastAsia="맑은 고딕"/>
                 <w:b w:val="0"/>
                 <w:color w:val="1A1D24"/>
                 <w:sz w:val="19"/>
               </w:rPr>
-              <w:t xml:space="preserve"> 라 다중 인스턴스에서 안 퍼짐</w:t>
+              <w:t>날짜 TEXT · 불리언 0/1 그대로 (전환 시 보존)</w:t>
             </w:r>
           </w:p>
         </w:tc>
@@ -12925,12 +13072,39 @@
             <w:r/>
             <w:r>
               <w:rPr>
+                <w:rFonts w:ascii="Consolas" w:hAnsi="Consolas" w:eastAsia="Consolas"/>
+                <w:b w:val="0"/>
+                <w:color w:val="223355"/>
+                <w:sz w:val="18"/>
+              </w:rPr>
+              <w:t>timestamptz</w:t>
+            </w:r>
+            <w:r>
+              <w:rPr>
                 <w:rFonts w:ascii="맑은 고딕" w:hAnsi="맑은 고딕" w:eastAsia="맑은 고딕"/>
                 <w:b w:val="0"/>
                 <w:color w:val="1A1D24"/>
                 <w:sz w:val="19"/>
               </w:rPr>
-              <w:t>Redis Pub/Sub 브로커</w:t>
+              <w:t xml:space="preserve"> · </w:t>
+            </w:r>
+            <w:r>
+              <w:rPr>
+                <w:rFonts w:ascii="Consolas" w:hAnsi="Consolas" w:eastAsia="Consolas"/>
+                <w:b w:val="0"/>
+                <w:color w:val="223355"/>
+                <w:sz w:val="18"/>
+              </w:rPr>
+              <w:t>boolean</w:t>
+            </w:r>
+            <w:r>
+              <w:rPr>
+                <w:rFonts w:ascii="맑은 고딕" w:hAnsi="맑은 고딕" w:eastAsia="맑은 고딕"/>
+                <w:b w:val="0"/>
+                <w:color w:val="1A1D24"/>
+                <w:sz w:val="19"/>
+              </w:rPr>
+              <w:t xml:space="preserve"> 마이그레이션</w:t>
             </w:r>
           </w:p>
         </w:tc>
@@ -12952,7 +13126,7 @@
                 <w:color w:val="1A1D24"/>
                 <w:sz w:val="19"/>
               </w:rPr>
-              <w:t>업로드 파일 공개</w:t>
+              <w:t>실시간 단일 프로세스 전제</w:t>
             </w:r>
           </w:p>
         </w:tc>
@@ -12972,7 +13146,7 @@
                 <w:color w:val="223355"/>
                 <w:sz w:val="18"/>
               </w:rPr>
-              <w:t>GET /uploads/:file</w:t>
+              <w:t>EventEmitter</w:t>
             </w:r>
             <w:r>
               <w:rPr>
@@ -12981,7 +13155,7 @@
                 <w:color w:val="1A1D24"/>
                 <w:sz w:val="19"/>
               </w:rPr>
-              <w:t xml:space="preserve"> 은 인증 없이 재생</w:t>
+              <w:t xml:space="preserve"> 라 다중 인스턴스에서 안 퍼짐</w:t>
             </w:r>
           </w:p>
         </w:tc>
@@ -13001,7 +13175,7 @@
                 <w:color w:val="1A1D24"/>
                 <w:sz w:val="19"/>
               </w:rPr>
-              <w:t>서명 URL + 비공개 영상</w:t>
+              <w:t>Redis Pub/Sub 브로커</w:t>
             </w:r>
           </w:p>
         </w:tc>
@@ -13023,7 +13197,7 @@
                 <w:color w:val="1A1D24"/>
                 <w:sz w:val="19"/>
               </w:rPr>
-              <w:t>검색 품질</w:t>
+              <w:t>업로드 파일 공개</w:t>
             </w:r>
           </w:p>
         </w:tc>
@@ -13038,12 +13212,21 @@
             <w:r/>
             <w:r>
               <w:rPr>
+                <w:rFonts w:ascii="Consolas" w:hAnsi="Consolas" w:eastAsia="Consolas"/>
+                <w:b w:val="0"/>
+                <w:color w:val="223355"/>
+                <w:sz w:val="18"/>
+              </w:rPr>
+              <w:t>GET /uploads/:file</w:t>
+            </w:r>
+            <w:r>
+              <w:rPr>
                 <w:rFonts w:ascii="맑은 고딕" w:hAnsi="맑은 고딕" w:eastAsia="맑은 고딕"/>
                 <w:b w:val="0"/>
                 <w:color w:val="1A1D24"/>
                 <w:sz w:val="19"/>
               </w:rPr>
-              <w:t>관련도 정렬·페이지네이션 없음</w:t>
+              <w:t xml:space="preserve"> 은 인증 없이 재생</w:t>
             </w:r>
           </w:p>
         </w:tc>
@@ -13063,7 +13246,78 @@
                 <w:color w:val="1A1D24"/>
                 <w:sz w:val="19"/>
               </w:rPr>
-              <w:t>FTS5 인덱스</w:t>
+              <w:t>서명 URL + 비공개 영상</w:t>
+            </w:r>
+          </w:p>
+        </w:tc>
+      </w:tr>
+      <w:tr>
+        <w:tc>
+          <w:tcPr>
+            <w:tcW w:type="dxa" w:w="3216"/>
+          </w:tcPr>
+          <w:p>
+            <w:pPr>
+              <w:spacing w:before="40" w:after="40"/>
+            </w:pPr>
+            <w:r/>
+            <w:r>
+              <w:rPr>
+                <w:rFonts w:ascii="맑은 고딕" w:hAnsi="맑은 고딕" w:eastAsia="맑은 고딕"/>
+                <w:b w:val="0"/>
+                <w:color w:val="1A1D24"/>
+                <w:sz w:val="19"/>
+              </w:rPr>
+              <w:t>검색 품질</w:t>
+            </w:r>
+          </w:p>
+        </w:tc>
+        <w:tc>
+          <w:tcPr>
+            <w:tcW w:type="dxa" w:w="3216"/>
+          </w:tcPr>
+          <w:p>
+            <w:pPr>
+              <w:spacing w:before="40" w:after="40"/>
+            </w:pPr>
+            <w:r/>
+            <w:r>
+              <w:rPr>
+                <w:rFonts w:ascii="맑은 고딕" w:hAnsi="맑은 고딕" w:eastAsia="맑은 고딕"/>
+                <w:b w:val="0"/>
+                <w:color w:val="1A1D24"/>
+                <w:sz w:val="19"/>
+              </w:rPr>
+              <w:t>관련도 정렬·페이지네이션 없음</w:t>
+            </w:r>
+          </w:p>
+        </w:tc>
+        <w:tc>
+          <w:tcPr>
+            <w:tcW w:type="dxa" w:w="3216"/>
+          </w:tcPr>
+          <w:p>
+            <w:pPr>
+              <w:spacing w:before="40" w:after="40"/>
+            </w:pPr>
+            <w:r/>
+            <w:r>
+              <w:rPr>
+                <w:rFonts w:ascii="Consolas" w:hAnsi="Consolas" w:eastAsia="Consolas"/>
+                <w:b w:val="0"/>
+                <w:color w:val="223355"/>
+                <w:sz w:val="18"/>
+              </w:rPr>
+              <w:t>pg_trgm</w:t>
+            </w:r>
+            <w:r>
+              <w:rPr>
+                <w:rFonts w:ascii="맑은 고딕" w:hAnsi="맑은 고딕" w:eastAsia="맑은 고딕"/>
+                <w:b w:val="0"/>
+                <w:color w:val="1A1D24"/>
+                <w:sz w:val="19"/>
+              </w:rPr>
+              <w:t xml:space="preserve"> / 전문 검색 인덱스</w:t>
             </w:r>
           </w:p>
         </w:tc>
@@ -13653,88 +13907,6 @@
                 <w:color w:val="1A1D24"/>
                 <w:sz w:val="19"/>
               </w:rPr>
-              <w:t>RDBMS 전환 (Postgres)</w:t>
-            </w:r>
-          </w:p>
-        </w:tc>
-        <w:tc>
-          <w:tcPr>
-            <w:tcW w:type="dxa" w:w="2412"/>
-          </w:tcPr>
-          <w:p>
-            <w:pPr>
-              <w:spacing w:before="40" w:after="40"/>
-            </w:pPr>
-            <w:r/>
-            <w:r>
-              <w:rPr>
-                <w:rFonts w:ascii="맑은 고딕" w:hAnsi="맑은 고딕" w:eastAsia="맑은 고딕"/>
-                <w:b w:val="0"/>
-                <w:color w:val="1A1D24"/>
-                <w:sz w:val="19"/>
-              </w:rPr>
-              <w:t>동시 쓰기·복제</w:t>
-            </w:r>
-          </w:p>
-        </w:tc>
-        <w:tc>
-          <w:tcPr>
-            <w:tcW w:type="dxa" w:w="2412"/>
-          </w:tcPr>
-          <w:p>
-            <w:pPr>
-              <w:spacing w:before="40" w:after="40"/>
-            </w:pPr>
-            <w:r/>
-            <w:r>
-              <w:rPr>
-                <w:rFonts w:ascii="맑은 고딕" w:hAnsi="맑은 고딕" w:eastAsia="맑은 고딕"/>
-                <w:b w:val="0"/>
-                <w:color w:val="1A1D24"/>
-                <w:sz w:val="19"/>
-              </w:rPr>
-              <w:t>SQLite 단일 파일 쓰기 락이 병목이 될 때</w:t>
-            </w:r>
-          </w:p>
-        </w:tc>
-      </w:tr>
-      <w:tr>
-        <w:tc>
-          <w:tcPr>
-            <w:tcW w:type="dxa" w:w="2412"/>
-          </w:tcPr>
-          <w:p>
-            <w:pPr>
-              <w:spacing w:before="40" w:after="40"/>
-            </w:pPr>
-            <w:r/>
-            <w:r>
-              <w:rPr>
-                <w:rFonts w:ascii="맑은 고딕" w:hAnsi="맑은 고딕" w:eastAsia="맑은 고딕"/>
-                <w:b w:val="0"/>
-                <w:color w:val="1A1D24"/>
-                <w:sz w:val="19"/>
-              </w:rPr>
-              <w:t>6</w:t>
-            </w:r>
-          </w:p>
-        </w:tc>
-        <w:tc>
-          <w:tcPr>
-            <w:tcW w:type="dxa" w:w="2412"/>
-          </w:tcPr>
-          <w:p>
-            <w:pPr>
-              <w:spacing w:before="40" w:after="40"/>
-            </w:pPr>
-            <w:r/>
-            <w:r>
-              <w:rPr>
-                <w:rFonts w:ascii="맑은 고딕" w:hAnsi="맑은 고딕" w:eastAsia="맑은 고딕"/>
-                <w:b/>
-                <w:color w:val="1A1D24"/>
-                <w:sz w:val="19"/>
-              </w:rPr>
               <w:t>작업 스케줄러</w:t>
             </w:r>
           </w:p>
@@ -14744,7 +14916,452 @@
           <w:color w:val="1A1D24"/>
           <w:sz w:val="25"/>
         </w:rPr>
-        <w:t xml:space="preserve">7.5 </w:t>
+        <w:t>7.5 SQLite → PostgreSQL 전환 (동기 API 를 비동기로)</w:t>
+      </w:r>
+    </w:p>
+    <w:p>
+      <w:r>
+        <w:rPr>
+          <w:rFonts w:ascii="맑은 고딕" w:hAnsi="맑은 고딕" w:eastAsia="맑은 고딕"/>
+          <w:b/>
+          <w:color w:val="1A1D24"/>
+          <w:sz w:val="21"/>
+        </w:rPr>
+        <w:t>배경</w:t>
+      </w:r>
+      <w:r>
+        <w:rPr>
+          <w:rFonts w:ascii="맑은 고딕" w:hAnsi="맑은 고딕" w:eastAsia="맑은 고딕"/>
+          <w:b w:val="0"/>
+          <w:color w:val="1A1D24"/>
+          <w:sz w:val="21"/>
+        </w:rPr>
+        <w:t xml:space="preserve"> — 백엔드를 상시 가동되는 서버(Oracle Cloud VM)에 올리기로 하면서, 파일 하나짜리 SQLite 대신 마이그레이션 이력·</w:t>
+      </w:r>
+      <w:r>
+        <w:rPr>
+          <w:rFonts w:ascii="Consolas" w:hAnsi="Consolas" w:eastAsia="Consolas"/>
+          <w:b w:val="0"/>
+          <w:color w:val="223355"/>
+          <w:sz w:val="20"/>
+        </w:rPr>
+        <w:t>pg_dump</w:t>
+      </w:r>
+      <w:r>
+        <w:rPr>
+          <w:rFonts w:ascii="맑은 고딕" w:hAnsi="맑은 고딕" w:eastAsia="맑은 고딕"/>
+          <w:b w:val="0"/>
+          <w:color w:val="1A1D24"/>
+          <w:sz w:val="21"/>
+        </w:rPr>
+        <w:t xml:space="preserve"> 백업이 있는 PostgreSQL 로 옮겼다. </w:t>
+      </w:r>
+      <w:r>
+        <w:rPr>
+          <w:rFonts w:ascii="Consolas" w:hAnsi="Consolas" w:eastAsia="Consolas"/>
+          <w:b w:val="0"/>
+          <w:color w:val="223355"/>
+          <w:sz w:val="20"/>
+        </w:rPr>
+        <w:t>better-sqlite3</w:t>
+      </w:r>
+      <w:r>
+        <w:rPr>
+          <w:rFonts w:ascii="맑은 고딕" w:hAnsi="맑은 고딕" w:eastAsia="맑은 고딕"/>
+          <w:b w:val="0"/>
+          <w:color w:val="1A1D24"/>
+          <w:sz w:val="21"/>
+        </w:rPr>
+        <w:t xml:space="preserve"> 는 </w:t>
+      </w:r>
+      <w:r>
+        <w:rPr>
+          <w:rFonts w:ascii="맑은 고딕" w:hAnsi="맑은 고딕" w:eastAsia="맑은 고딕"/>
+          <w:b/>
+          <w:color w:val="1A1D24"/>
+          <w:sz w:val="21"/>
+        </w:rPr>
+        <w:t>동기</w:t>
+      </w:r>
+      <w:r>
+        <w:rPr>
+          <w:rFonts w:ascii="맑은 고딕" w:hAnsi="맑은 고딕" w:eastAsia="맑은 고딕"/>
+          <w:b w:val="0"/>
+          <w:color w:val="1A1D24"/>
+          <w:sz w:val="21"/>
+        </w:rPr>
+        <w:t xml:space="preserve"> API 라 </w:t>
+      </w:r>
+      <w:r>
+        <w:rPr>
+          <w:rFonts w:ascii="Consolas" w:hAnsi="Consolas" w:eastAsia="Consolas"/>
+          <w:b w:val="0"/>
+          <w:color w:val="223355"/>
+          <w:sz w:val="20"/>
+        </w:rPr>
+        <w:t>store.ts</w:t>
+      </w:r>
+      <w:r>
+        <w:rPr>
+          <w:rFonts w:ascii="맑은 고딕" w:hAnsi="맑은 고딕" w:eastAsia="맑은 고딕"/>
+          <w:b w:val="0"/>
+          <w:color w:val="1A1D24"/>
+          <w:sz w:val="21"/>
+        </w:rPr>
+        <w:t xml:space="preserve"> 1,600줄과 라우트 25개가 전부 </w:t>
+      </w:r>
+      <w:r>
+        <w:rPr>
+          <w:rFonts w:ascii="Consolas" w:hAnsi="Consolas" w:eastAsia="Consolas"/>
+          <w:b w:val="0"/>
+          <w:color w:val="223355"/>
+          <w:sz w:val="20"/>
+        </w:rPr>
+        <w:t>await</w:t>
+      </w:r>
+      <w:r>
+        <w:rPr>
+          <w:rFonts w:ascii="맑은 고딕" w:hAnsi="맑은 고딕" w:eastAsia="맑은 고딕"/>
+          <w:b w:val="0"/>
+          <w:color w:val="1A1D24"/>
+          <w:sz w:val="21"/>
+        </w:rPr>
+        <w:t xml:space="preserve"> 를 몰랐다.</w:t>
+      </w:r>
+    </w:p>
+    <w:p>
+      <w:r>
+        <w:rPr>
+          <w:rFonts w:ascii="맑은 고딕" w:hAnsi="맑은 고딕" w:eastAsia="맑은 고딕"/>
+          <w:b/>
+          <w:color w:val="1A1D24"/>
+          <w:sz w:val="21"/>
+        </w:rPr>
+        <w:t>작업</w:t>
+      </w:r>
+    </w:p>
+    <w:p>
+      <w:pPr>
+        <w:pStyle w:val="ListBullet"/>
+        <w:spacing w:after="40"/>
+        <w:ind w:left="360"/>
+      </w:pPr>
+      <w:r>
+        <w:rPr>
+          <w:rFonts w:ascii="맑은 고딕" w:hAnsi="맑은 고딕" w:eastAsia="맑은 고딕"/>
+          <w:b w:val="0"/>
+          <w:color w:val="1A1D24"/>
+          <w:sz w:val="21"/>
+        </w:rPr>
+        <w:t xml:space="preserve">SQL 문장은 그대로 두고 호출 모양만 바꾸는 얇은 래퍼를 만들었다 — </w:t>
+      </w:r>
+      <w:r>
+        <w:rPr>
+          <w:rFonts w:ascii="Consolas" w:hAnsi="Consolas" w:eastAsia="Consolas"/>
+          <w:b w:val="0"/>
+          <w:color w:val="223355"/>
+          <w:sz w:val="20"/>
+        </w:rPr>
+        <w:t>?</w:t>
+      </w:r>
+      <w:r>
+        <w:rPr>
+          <w:rFonts w:ascii="맑은 고딕" w:hAnsi="맑은 고딕" w:eastAsia="맑은 고딕"/>
+          <w:b w:val="0"/>
+          <w:color w:val="1A1D24"/>
+          <w:sz w:val="21"/>
+        </w:rPr>
+        <w:t xml:space="preserve"> 자리표시자를 </w:t>
+      </w:r>
+      <w:r>
+        <w:rPr>
+          <w:rFonts w:ascii="Consolas" w:hAnsi="Consolas" w:eastAsia="Consolas"/>
+          <w:b w:val="0"/>
+          <w:color w:val="223355"/>
+          <w:sz w:val="20"/>
+        </w:rPr>
+        <w:t>$1…</w:t>
+      </w:r>
+      <w:r>
+        <w:rPr>
+          <w:rFonts w:ascii="맑은 고딕" w:hAnsi="맑은 고딕" w:eastAsia="맑은 고딕"/>
+          <w:b w:val="0"/>
+          <w:color w:val="1A1D24"/>
+          <w:sz w:val="21"/>
+        </w:rPr>
+        <w:t xml:space="preserve"> 로 바꿔 준다. diff 가 "쿼리 재작성"이 아니라 "await 추가"로 읽히게 하려는 목적이었다.</w:t>
+      </w:r>
+    </w:p>
+    <w:p>
+      <w:pPr>
+        <w:pStyle w:val="ListBullet"/>
+        <w:spacing w:after="40"/>
+        <w:ind w:left="360"/>
+      </w:pPr>
+      <w:r>
+        <w:rPr>
+          <w:rFonts w:ascii="맑은 고딕" w:hAnsi="맑은 고딕" w:eastAsia="맑은 고딕"/>
+          <w:b/>
+          <w:color w:val="1A1D24"/>
+          <w:sz w:val="21"/>
+        </w:rPr>
+        <w:t>컬럼 타입은 일부러 보존했다.</w:t>
+      </w:r>
+      <w:r>
+        <w:rPr>
+          <w:rFonts w:ascii="맑은 고딕" w:hAnsi="맑은 고딕" w:eastAsia="맑은 고딕"/>
+          <w:b w:val="0"/>
+          <w:color w:val="1A1D24"/>
+          <w:sz w:val="21"/>
+        </w:rPr>
+        <w:t xml:space="preserve"> 날짜를 </w:t>
+      </w:r>
+      <w:r>
+        <w:rPr>
+          <w:rFonts w:ascii="Consolas" w:hAnsi="Consolas" w:eastAsia="Consolas"/>
+          <w:b w:val="0"/>
+          <w:color w:val="223355"/>
+          <w:sz w:val="20"/>
+        </w:rPr>
+        <w:t>timestamptz</w:t>
+      </w:r>
+      <w:r>
+        <w:rPr>
+          <w:rFonts w:ascii="맑은 고딕" w:hAnsi="맑은 고딕" w:eastAsia="맑은 고딕"/>
+          <w:b w:val="0"/>
+          <w:color w:val="1A1D24"/>
+          <w:sz w:val="21"/>
+        </w:rPr>
+        <w:t xml:space="preserve"> 로 바꾸면 API 응답 형식까지 흔들린다. DB 엔진 교체와 타입 정교화를 한 번에 하지 않은 덕에 </w:t>
+      </w:r>
+      <w:r>
+        <w:rPr>
+          <w:rFonts w:ascii="맑은 고딕" w:hAnsi="맑은 고딕" w:eastAsia="맑은 고딕"/>
+          <w:b/>
+          <w:color w:val="1A1D24"/>
+          <w:sz w:val="21"/>
+        </w:rPr>
+        <w:t>기존 테스트 137건이 한 줄도 안 바뀌고 통과</w:t>
+      </w:r>
+      <w:r>
+        <w:rPr>
+          <w:rFonts w:ascii="맑은 고딕" w:hAnsi="맑은 고딕" w:eastAsia="맑은 고딕"/>
+          <w:b w:val="0"/>
+          <w:color w:val="1A1D24"/>
+          <w:sz w:val="21"/>
+        </w:rPr>
+        <w:t>했다.</w:t>
+      </w:r>
+    </w:p>
+    <w:p>
+      <w:pPr>
+        <w:pStyle w:val="ListBullet"/>
+        <w:spacing w:after="40"/>
+        <w:ind w:left="360"/>
+      </w:pPr>
+      <w:r>
+        <w:rPr>
+          <w:rFonts w:ascii="맑은 고딕" w:hAnsi="맑은 고딕" w:eastAsia="맑은 고딕"/>
+          <w:b w:val="0"/>
+          <w:color w:val="1A1D24"/>
+          <w:sz w:val="21"/>
+        </w:rPr>
+        <w:t>실데이터는 이관 스크립트로 옮겼다. FK 순서·한 트랜잭션·IDENTITY 시퀀스 보정 후 22개 테이블 행 수를 비교한다(로컬 데이터 151행 일치).</w:t>
+      </w:r>
+    </w:p>
+    <w:p>
+      <w:r>
+        <w:rPr>
+          <w:rFonts w:ascii="맑은 고딕" w:hAnsi="맑은 고딕" w:eastAsia="맑은 고딕"/>
+          <w:b/>
+          <w:color w:val="1A1D24"/>
+          <w:sz w:val="21"/>
+        </w:rPr>
+        <w:t>잡은 함정 두 가지</w:t>
+      </w:r>
+    </w:p>
+    <w:p>
+      <w:pPr>
+        <w:pStyle w:val="ListNumber"/>
+        <w:spacing w:after="40"/>
+        <w:ind w:left="360"/>
+      </w:pPr>
+      <w:r>
+        <w:rPr>
+          <w:rFonts w:ascii="맑은 고딕" w:hAnsi="맑은 고딕" w:eastAsia="맑은 고딕"/>
+          <w:b/>
+          <w:color w:val="1A1D24"/>
+          <w:sz w:val="21"/>
+        </w:rPr>
+        <w:t>Express 4 는 async 핸들러의 실패를 잡지 못한다.</w:t>
+      </w:r>
+      <w:r>
+        <w:rPr>
+          <w:rFonts w:ascii="맑은 고딕" w:hAnsi="맑은 고딕" w:eastAsia="맑은 고딕"/>
+          <w:b w:val="0"/>
+          <w:color w:val="1A1D24"/>
+          <w:sz w:val="21"/>
+        </w:rPr>
+        <w:t xml:space="preserve"> </w:t>
+      </w:r>
+      <w:r>
+        <w:rPr>
+          <w:rFonts w:ascii="Consolas" w:hAnsi="Consolas" w:eastAsia="Consolas"/>
+          <w:b w:val="0"/>
+          <w:color w:val="223355"/>
+          <w:sz w:val="20"/>
+        </w:rPr>
+        <w:t>requireRequestUser</w:t>
+      </w:r>
+      <w:r>
+        <w:rPr>
+          <w:rFonts w:ascii="맑은 고딕" w:hAnsi="맑은 고딕" w:eastAsia="맑은 고딕"/>
+          <w:b w:val="0"/>
+          <w:color w:val="1A1D24"/>
+          <w:sz w:val="21"/>
+        </w:rPr>
+        <w:t xml:space="preserve"> 의 401 이 응답 없이 매달린다. 라우터 생성 지점에서 감싸는 </w:t>
+      </w:r>
+      <w:r>
+        <w:rPr>
+          <w:rFonts w:ascii="Consolas" w:hAnsi="Consolas" w:eastAsia="Consolas"/>
+          <w:b w:val="0"/>
+          <w:color w:val="223355"/>
+          <w:sz w:val="20"/>
+        </w:rPr>
+        <w:t>asyncRouter</w:t>
+      </w:r>
+      <w:r>
+        <w:rPr>
+          <w:rFonts w:ascii="맑은 고딕" w:hAnsi="맑은 고딕" w:eastAsia="맑은 고딕"/>
+          <w:b w:val="0"/>
+          <w:color w:val="1A1D24"/>
+          <w:sz w:val="21"/>
+        </w:rPr>
+        <w:t xml:space="preserve"> 를 만들어 25개 라우트에 한 번에 적용했다.</w:t>
+      </w:r>
+    </w:p>
+    <w:p>
+      <w:pPr>
+        <w:pStyle w:val="ListNumber"/>
+        <w:spacing w:after="40"/>
+        <w:ind w:left="360"/>
+      </w:pPr>
+      <w:r>
+        <w:rPr>
+          <w:rFonts w:ascii="Consolas" w:hAnsi="Consolas" w:eastAsia="Consolas"/>
+          <w:b/>
+          <w:color w:val="223355"/>
+          <w:sz w:val="20"/>
+        </w:rPr>
+        <w:t>{ ...getPlaylistById(id) }</w:t>
+      </w:r>
+      <w:r>
+        <w:rPr>
+          <w:rFonts w:ascii="맑은 고딕" w:hAnsi="맑은 고딕" w:eastAsia="맑은 고딕"/>
+          <w:b/>
+          <w:color w:val="1A1D24"/>
+          <w:sz w:val="21"/>
+        </w:rPr>
+        <w:t xml:space="preserve"> — Promise 를 spread 하면 </w:t>
+      </w:r>
+      <w:r>
+        <w:rPr>
+          <w:rFonts w:ascii="Consolas" w:hAnsi="Consolas" w:eastAsia="Consolas"/>
+          <w:b/>
+          <w:color w:val="223355"/>
+          <w:sz w:val="20"/>
+        </w:rPr>
+        <w:t>{}</w:t>
+      </w:r>
+      <w:r>
+        <w:rPr>
+          <w:rFonts w:ascii="맑은 고딕" w:hAnsi="맑은 고딕" w:eastAsia="맑은 고딕"/>
+          <w:b/>
+          <w:color w:val="1A1D24"/>
+          <w:sz w:val="21"/>
+        </w:rPr>
+        <w:t xml:space="preserve"> 가 되는데 TypeScript 가 경고하지 않는다.</w:t>
+      </w:r>
+      <w:r>
+        <w:rPr>
+          <w:rFonts w:ascii="맑은 고딕" w:hAnsi="맑은 고딕" w:eastAsia="맑은 고딕"/>
+          <w:b w:val="0"/>
+          <w:color w:val="1A1D24"/>
+          <w:sz w:val="21"/>
+        </w:rPr>
+        <w:t xml:space="preserve"> 타입체크가 통과해도 안심할 수 없어서, await 없이 호출된 async 함수를 찾는 스크립트로 전수 검사했다.</w:t>
+      </w:r>
+    </w:p>
+    <w:p>
+      <w:r>
+        <w:rPr>
+          <w:rFonts w:ascii="맑은 고딕" w:hAnsi="맑은 고딕" w:eastAsia="맑은 고딕"/>
+          <w:b/>
+          <w:color w:val="1A1D24"/>
+          <w:sz w:val="21"/>
+        </w:rPr>
+        <w:t>배운 것</w:t>
+      </w:r>
+      <w:r>
+        <w:rPr>
+          <w:rFonts w:ascii="맑은 고딕" w:hAnsi="맑은 고딕" w:eastAsia="맑은 고딕"/>
+          <w:b w:val="0"/>
+          <w:color w:val="1A1D24"/>
+          <w:sz w:val="21"/>
+        </w:rPr>
+        <w:t xml:space="preserve"> — 큰 전환은 "무엇을 바꾸지 않을지"를 먼저 정해야 검증이 가능하다. 타입을 보존했기 때문에 "기존 테스트가 그대로 통과한다"가 곧 합격 기준이 되었다. 그리고 전환 후에도 놓친 곳이 있었다 — E2E 설정이 옛 </w:t>
+      </w:r>
+      <w:r>
+        <w:rPr>
+          <w:rFonts w:ascii="Consolas" w:hAnsi="Consolas" w:eastAsia="Consolas"/>
+          <w:b w:val="0"/>
+          <w:color w:val="223355"/>
+          <w:sz w:val="20"/>
+        </w:rPr>
+        <w:t>SQLITE_PATH</w:t>
+      </w:r>
+      <w:r>
+        <w:rPr>
+          <w:rFonts w:ascii="맑은 고딕" w:hAnsi="맑은 고딕" w:eastAsia="맑은 고딕"/>
+          <w:b w:val="0"/>
+          <w:color w:val="1A1D24"/>
+          <w:sz w:val="21"/>
+        </w:rPr>
+        <w:t xml:space="preserve"> 를 넘기고 있어 </w:t>
+      </w:r>
+      <w:r>
+        <w:rPr>
+          <w:rFonts w:ascii="맑은 고딕" w:hAnsi="맑은 고딕" w:eastAsia="맑은 고딕"/>
+          <w:b/>
+          <w:color w:val="1A1D24"/>
+          <w:sz w:val="21"/>
+        </w:rPr>
+        <w:t>개발 DB 로 조용히 성공</w:t>
+      </w:r>
+      <w:r>
+        <w:rPr>
+          <w:rFonts w:ascii="맑은 고딕" w:hAnsi="맑은 고딕" w:eastAsia="맑은 고딕"/>
+          <w:b w:val="0"/>
+          <w:color w:val="1A1D24"/>
+          <w:sz w:val="21"/>
+        </w:rPr>
+        <w:t>하고 있었다(099 에서 수정). 실패하지 않는 버그가 가장 늦게 발견된다.</w:t>
+      </w:r>
+    </w:p>
+    <w:p>
+      <w:pPr>
+        <w:keepNext/>
+        <w:spacing w:before="240" w:after="120"/>
+      </w:pPr>
+      <w:r>
+        <w:rPr>
+          <w:rFonts w:ascii="맑은 고딕" w:hAnsi="맑은 고딕" w:eastAsia="맑은 고딕"/>
+          <w:b/>
+          <w:color w:val="1A1D24"/>
+          <w:sz w:val="25"/>
+        </w:rPr>
+        <w:t xml:space="preserve">7.6 </w:t>
       </w:r>
       <w:r>
         <w:rPr>
@@ -15083,7 +15700,7 @@
                 <w:color w:val="1A1D24"/>
                 <w:sz w:val="19"/>
               </w:rPr>
-              <w:t>137</w:t>
+              <w:t>148</w:t>
             </w:r>
           </w:p>
         </w:tc>
@@ -15103,7 +15720,7 @@
                 <w:color w:val="1A1D24"/>
                 <w:sz w:val="19"/>
               </w:rPr>
-              <w:t>인증·쇼츠·댓글·팔로우·재생목록·검색·관리자 API 등</w:t>
+              <w:t>인증·쇼츠·댓글·팔로우·재생목록·검색·관리자 API·마이그레이션·데이터 이관</w:t>
             </w:r>
           </w:p>
         </w:tc>
@@ -15363,6 +15980,88 @@
           </w:p>
         </w:tc>
       </w:tr>
+      <w:tr>
+        <w:tc>
+          <w:tcPr>
+            <w:tcW w:type="dxa" w:w="2412"/>
+          </w:tcPr>
+          <w:p>
+            <w:pPr>
+              <w:spacing w:before="40" w:after="40"/>
+            </w:pPr>
+            <w:r/>
+            <w:r>
+              <w:rPr>
+                <w:rFonts w:ascii="맑은 고딕" w:hAnsi="맑은 고딕" w:eastAsia="맑은 고딕"/>
+                <w:b w:val="0"/>
+                <w:color w:val="1A1D24"/>
+                <w:sz w:val="19"/>
+              </w:rPr>
+              <w:t>CI</w:t>
+            </w:r>
+          </w:p>
+        </w:tc>
+        <w:tc>
+          <w:tcPr>
+            <w:tcW w:type="dxa" w:w="2412"/>
+          </w:tcPr>
+          <w:p>
+            <w:pPr>
+              <w:spacing w:before="40" w:after="40"/>
+            </w:pPr>
+            <w:r/>
+            <w:r>
+              <w:rPr>
+                <w:rFonts w:ascii="맑은 고딕" w:hAnsi="맑은 고딕" w:eastAsia="맑은 고딕"/>
+                <w:b w:val="0"/>
+                <w:color w:val="1A1D24"/>
+                <w:sz w:val="19"/>
+              </w:rPr>
+              <w:t>GitHub Actions</w:t>
+            </w:r>
+          </w:p>
+        </w:tc>
+        <w:tc>
+          <w:tcPr>
+            <w:tcW w:type="dxa" w:w="2412"/>
+          </w:tcPr>
+          <w:p>
+            <w:pPr>
+              <w:spacing w:before="40" w:after="40"/>
+            </w:pPr>
+            <w:r/>
+            <w:r>
+              <w:rPr>
+                <w:rFonts w:ascii="맑은 고딕" w:hAnsi="맑은 고딕" w:eastAsia="맑은 고딕"/>
+                <w:b w:val="0"/>
+                <w:color w:val="1A1D24"/>
+                <w:sz w:val="19"/>
+              </w:rPr>
+              <w:t>PR · master push</w:t>
+            </w:r>
+          </w:p>
+        </w:tc>
+        <w:tc>
+          <w:tcPr>
+            <w:tcW w:type="dxa" w:w="2412"/>
+          </w:tcPr>
+          <w:p>
+            <w:pPr>
+              <w:spacing w:before="40" w:after="40"/>
+            </w:pPr>
+            <w:r/>
+            <w:r>
+              <w:rPr>
+                <w:rFonts w:ascii="맑은 고딕" w:hAnsi="맑은 고딕" w:eastAsia="맑은 고딕"/>
+                <w:b w:val="0"/>
+                <w:color w:val="1A1D24"/>
+                <w:sz w:val="19"/>
+              </w:rPr>
+              <w:t>백엔드(Postgres 16 서비스 컨테이너)·프론트·콘솔</w:t>
+            </w:r>
+          </w:p>
+        </w:tc>
+      </w:tr>
     </w:tbl>
     <w:p>
       <w:pPr>
@@ -15377,7 +16076,25 @@
           <w:color w:val="1A1D24"/>
           <w:sz w:val="21"/>
         </w:rPr>
-        <w:t>E2E는 격리된 포트(백엔드 4310 / 프론트 3310)와 임시 SQLite로 서버를 직접 띄운다. 개발 중인 서버 상태에 영향을 받지 않는다.</w:t>
+        <w:t xml:space="preserve">E2E는 격리된 포트(백엔드 4310 / 프론트 3310)와 테스트 DB 의 </w:t>
+      </w:r>
+      <w:r>
+        <w:rPr>
+          <w:rFonts w:ascii="Consolas" w:hAnsi="Consolas" w:eastAsia="Consolas"/>
+          <w:b w:val="0"/>
+          <w:color w:val="223355"/>
+          <w:sz w:val="20"/>
+        </w:rPr>
+        <w:t>e2e</w:t>
+      </w:r>
+      <w:r>
+        <w:rPr>
+          <w:rFonts w:ascii="맑은 고딕" w:hAnsi="맑은 고딕" w:eastAsia="맑은 고딕"/>
+          <w:b w:val="0"/>
+          <w:color w:val="1A1D24"/>
+          <w:sz w:val="21"/>
+        </w:rPr>
+        <w:t xml:space="preserve"> 스키마(매번 초기화)로 서버를 직접 띄운다. 개발 중인 서버·DB 상태에 영향을 받지 않는다.</w:t>
       </w:r>
     </w:p>
     <w:p>
@@ -15460,7 +16177,7 @@
           <w:color w:val="1A1D24"/>
           <w:sz w:val="21"/>
         </w:rPr>
-        <w:t>를 남기고 인덱스에 한 줄 추가한다. 현재 92편.</w:t>
+        <w:t>를 남기고 인덱스에 한 줄 추가한다. 현재 100편.</w:t>
       </w:r>
     </w:p>
     <w:p>
@@ -15758,7 +16475,7 @@
                 <w:color w:val="1A1D24"/>
                 <w:sz w:val="19"/>
               </w:rPr>
-              <w:t>Cloudflare Tunnel (Workers 부적합)</w:t>
+              <w:t>Oracle Cloud VM — Caddy(HTTPS) + systemd + PostgreSQL 16</w:t>
             </w:r>
           </w:p>
         </w:tc>
@@ -15778,7 +16495,7 @@
                 <w:color w:val="1A1D24"/>
                 <w:sz w:val="19"/>
               </w:rPr>
-              <w:t>미공개</w:t>
+              <w:t>스크립트 준비됨 · 구축 전</w:t>
             </w:r>
           </w:p>
         </w:tc>
@@ -15797,25 +16514,7 @@
           <w:color w:val="1A1D24"/>
           <w:sz w:val="21"/>
         </w:rPr>
-        <w:t xml:space="preserve">백엔드를 Workers에 올리지 않은 이유는 명확하다. </w:t>
-      </w:r>
-      <w:r>
-        <w:rPr>
-          <w:rFonts w:ascii="Consolas" w:hAnsi="Consolas" w:eastAsia="Consolas"/>
-          <w:b w:val="0"/>
-          <w:color w:val="223355"/>
-          <w:sz w:val="20"/>
-        </w:rPr>
-        <w:t>better-sqlite3</w:t>
-      </w:r>
-      <w:r>
-        <w:rPr>
-          <w:rFonts w:ascii="맑은 고딕" w:hAnsi="맑은 고딕" w:eastAsia="맑은 고딕"/>
-          <w:b w:val="0"/>
-          <w:color w:val="1A1D24"/>
-          <w:sz w:val="21"/>
-        </w:rPr>
-        <w:t xml:space="preserve"> 는 </w:t>
+        <w:t xml:space="preserve">백엔드를 Workers에 올리지 않은 이유는 명확하다. DB 와 업로드 파일은 </w:t>
       </w:r>
       <w:r>
         <w:rPr>
@@ -15824,7 +16523,7 @@
           <w:color w:val="1A1D24"/>
           <w:sz w:val="21"/>
         </w:rPr>
-        <w:t>네이티브 바인딩 + 로컬 파일 시스템</w:t>
+        <w:t>영구 디스크</w:t>
       </w:r>
       <w:r>
         <w:rPr>
@@ -15833,10 +16532,8 @@
           <w:color w:val="1A1D24"/>
           <w:sz w:val="21"/>
         </w:rPr>
-        <w:t>을 요구하고, 업로드 파일도 디스크에 쓴다. Workers 런타임에는 둘 다 없다. 그래서 백엔드는 Tunnel로 노출하는 경로를 택했다.</w:t>
-      </w:r>
-    </w:p>
-    <w:p>
+        <w:t xml:space="preserve">가, SSE·WebSocket 은 </w:t>
+      </w:r>
       <w:r>
         <w:rPr>
           <w:rFonts w:ascii="맑은 고딕" w:hAnsi="맑은 고딕" w:eastAsia="맑은 고딕"/>
@@ -15844,7 +16541,7 @@
           <w:color w:val="1A1D24"/>
           <w:sz w:val="21"/>
         </w:rPr>
-        <w:t>현재 상태</w:t>
+        <w:t>상시 프로세스</w:t>
       </w:r>
       <w:r>
         <w:rPr>
@@ -15853,7 +16550,7 @@
           <w:color w:val="1A1D24"/>
           <w:sz w:val="21"/>
         </w:rPr>
-        <w:t xml:space="preserve">: 프론트 2종은 배포되어 있으나 공개 백엔드 주소가 연결되기 전이라 </w:t>
+        <w:t xml:space="preserve">가 필요하다. Workers 런타임에는 둘 다 없다. 처음엔 내 PC 를 Cloudflare Tunnel 로 노출하려 했지만 PC 가 꺼지면 서비스도 멈춘다. 그래서 </w:t>
       </w:r>
       <w:r>
         <w:rPr>
@@ -15862,7 +16559,7 @@
           <w:color w:val="1A1D24"/>
           <w:sz w:val="21"/>
         </w:rPr>
-        <w:t>UI 확인용</w:t>
+        <w:t>블록 볼륨이 붙은 VM 1대</w:t>
       </w:r>
       <w:r>
         <w:rPr>
@@ -15871,7 +16568,460 @@
           <w:color w:val="1A1D24"/>
           <w:sz w:val="21"/>
         </w:rPr>
-        <w:t>이다. 전체 기능은 로컬 실행으로 확인할 수 있다.</w:t>
+        <w:t>로 정했다.</w:t>
+      </w:r>
+    </w:p>
+    <w:p>
+      <w:pPr>
+        <w:spacing w:before="0" w:after="0"/>
+        <w:ind w:left="259"/>
+        <w:shd w:val="clear" w:fill="F4F5F8"/>
+      </w:pPr>
+      <w:r>
+        <w:rPr>
+          <w:rFonts w:ascii="Consolas" w:hAnsi="Consolas" w:eastAsia="Consolas"/>
+          <w:b w:val="0"/>
+          <w:color w:val="223355"/>
+          <w:sz w:val="20"/>
+        </w:rPr>
+        <w:t>app.&lt;도메인&gt;      → Cloudflare Workers (FrontServer)</w:t>
+      </w:r>
+    </w:p>
+    <w:p>
+      <w:pPr>
+        <w:spacing w:before="0" w:after="0"/>
+        <w:ind w:left="259"/>
+        <w:shd w:val="clear" w:fill="F4F5F8"/>
+      </w:pPr>
+      <w:r>
+        <w:rPr>
+          <w:rFonts w:ascii="Consolas" w:hAnsi="Consolas" w:eastAsia="Consolas"/>
+          <w:b w:val="0"/>
+          <w:color w:val="223355"/>
+          <w:sz w:val="20"/>
+        </w:rPr>
+        <w:t>console.&lt;도메인&gt;  → Cloudflare Workers (console)</w:t>
+      </w:r>
+    </w:p>
+    <w:p>
+      <w:pPr>
+        <w:spacing w:before="0" w:after="0"/>
+        <w:ind w:left="259"/>
+        <w:shd w:val="clear" w:fill="F4F5F8"/>
+      </w:pPr>
+      <w:r>
+        <w:rPr>
+          <w:rFonts w:ascii="Consolas" w:hAnsi="Consolas" w:eastAsia="Consolas"/>
+          <w:b w:val="0"/>
+          <w:color w:val="223355"/>
+          <w:sz w:val="20"/>
+        </w:rPr>
+        <w:t>api.&lt;도메인&gt;      → Oracle VM ─ Caddy :443 ─┬─ /uploads/*  디스크에서 직접</w:t>
+      </w:r>
+    </w:p>
+    <w:p>
+      <w:pPr>
+        <w:spacing w:before="0" w:after="0"/>
+        <w:ind w:left="259"/>
+        <w:shd w:val="clear" w:fill="F4F5F8"/>
+      </w:pPr>
+      <w:r>
+        <w:rPr>
+          <w:rFonts w:ascii="Consolas" w:hAnsi="Consolas" w:eastAsia="Consolas"/>
+          <w:b w:val="0"/>
+          <w:color w:val="223355"/>
+          <w:sz w:val="20"/>
+        </w:rPr>
+        <w:t xml:space="preserve">                                           └─ 그 외       BackendServer :4000 → PostgreSQL :5432(localhost)</w:t>
+      </w:r>
+    </w:p>
+    <w:p>
+      <w:pPr>
+        <w:spacing w:before="0" w:after="0"/>
+        <w:ind w:left="259"/>
+        <w:shd w:val="clear" w:fill="F4F5F8"/>
+      </w:pPr>
+      <w:r>
+        <w:rPr>
+          <w:rFonts w:ascii="Consolas" w:hAnsi="Consolas" w:eastAsia="Consolas"/>
+          <w:b w:val="0"/>
+          <w:color w:val="223355"/>
+          <w:sz w:val="20"/>
+        </w:rPr>
+        <w:t xml:space="preserve">                     블록 볼륨 /mnt/vidshare-data — pgdata · uploads · backups</w:t>
+      </w:r>
+    </w:p>
+    <w:p>
+      <w:pPr>
+        <w:spacing w:after="40"/>
+      </w:pPr>
+    </w:p>
+    <w:tbl>
+      <w:tblPr>
+        <w:tblStyle w:val="TableGrid"/>
+        <w:tblW w:type="auto" w:w="0"/>
+        <w:jc w:val="center"/>
+        <w:tblLook w:firstColumn="1" w:firstRow="1" w:lastColumn="0" w:lastRow="0" w:noHBand="0" w:noVBand="1" w:val="04A0"/>
+      </w:tblPr>
+      <w:tblGrid>
+        <w:gridCol w:w="4824"/>
+        <w:gridCol w:w="4824"/>
+      </w:tblGrid>
+      <w:tr>
+        <w:tc>
+          <w:tcPr>
+            <w:tcW w:type="dxa" w:w="4824"/>
+            <w:shd w:val="clear" w:fill="EEF0F6"/>
+          </w:tcPr>
+          <w:p>
+            <w:pPr>
+              <w:spacing w:before="60" w:after="60"/>
+            </w:pPr>
+            <w:r/>
+            <w:r>
+              <w:rPr>
+                <w:rFonts w:ascii="맑은 고딕" w:hAnsi="맑은 고딕" w:eastAsia="맑은 고딕"/>
+                <w:b/>
+                <w:color w:val="1A1D24"/>
+                <w:sz w:val="19"/>
+              </w:rPr>
+              <w:t>준비한 것</w:t>
+            </w:r>
+          </w:p>
+        </w:tc>
+        <w:tc>
+          <w:tcPr>
+            <w:tcW w:type="dxa" w:w="4824"/>
+            <w:shd w:val="clear" w:fill="EEF0F6"/>
+          </w:tcPr>
+          <w:p>
+            <w:pPr>
+              <w:spacing w:before="60" w:after="60"/>
+            </w:pPr>
+            <w:r/>
+            <w:r>
+              <w:rPr>
+                <w:rFonts w:ascii="맑은 고딕" w:hAnsi="맑은 고딕" w:eastAsia="맑은 고딕"/>
+                <w:b/>
+                <w:color w:val="1A1D24"/>
+                <w:sz w:val="19"/>
+              </w:rPr>
+              <w:t>내용</w:t>
+            </w:r>
+          </w:p>
+        </w:tc>
+      </w:tr>
+      <w:tr>
+        <w:tc>
+          <w:tcPr>
+            <w:tcW w:type="dxa" w:w="4824"/>
+          </w:tcPr>
+          <w:p>
+            <w:pPr>
+              <w:spacing w:before="40" w:after="40"/>
+            </w:pPr>
+            <w:r/>
+            <w:r>
+              <w:rPr>
+                <w:rFonts w:ascii="Consolas" w:hAnsi="Consolas" w:eastAsia="Consolas"/>
+                <w:b w:val="0"/>
+                <w:color w:val="223355"/>
+                <w:sz w:val="18"/>
+              </w:rPr>
+              <w:t>deploy/oracle/setup-vm.sh</w:t>
+            </w:r>
+          </w:p>
+        </w:tc>
+        <w:tc>
+          <w:tcPr>
+            <w:tcW w:type="dxa" w:w="4824"/>
+          </w:tcPr>
+          <w:p>
+            <w:pPr>
+              <w:spacing w:before="40" w:after="40"/>
+            </w:pPr>
+            <w:r/>
+            <w:r>
+              <w:rPr>
+                <w:rFonts w:ascii="맑은 고딕" w:hAnsi="맑은 고딕" w:eastAsia="맑은 고딕"/>
+                <w:b w:val="0"/>
+                <w:color w:val="1A1D24"/>
+                <w:sz w:val="19"/>
+              </w:rPr>
+              <w:t>Node 24·Postgres 16·Caddy 설치, 볼륨 마운트, DB 이전, systemd, 방화벽</w:t>
+            </w:r>
+          </w:p>
+        </w:tc>
+      </w:tr>
+      <w:tr>
+        <w:tc>
+          <w:tcPr>
+            <w:tcW w:type="dxa" w:w="4824"/>
+          </w:tcPr>
+          <w:p>
+            <w:pPr>
+              <w:spacing w:before="40" w:after="40"/>
+            </w:pPr>
+            <w:r/>
+            <w:r>
+              <w:rPr>
+                <w:rFonts w:ascii="Consolas" w:hAnsi="Consolas" w:eastAsia="Consolas"/>
+                <w:b w:val="0"/>
+                <w:color w:val="223355"/>
+                <w:sz w:val="18"/>
+              </w:rPr>
+              <w:t>deploy/oracle/deploy.sh</w:t>
+            </w:r>
+          </w:p>
+        </w:tc>
+        <w:tc>
+          <w:tcPr>
+            <w:tcW w:type="dxa" w:w="4824"/>
+          </w:tcPr>
+          <w:p>
+            <w:pPr>
+              <w:spacing w:before="40" w:after="40"/>
+            </w:pPr>
+            <w:r/>
+            <w:r>
+              <w:rPr>
+                <w:rFonts w:ascii="맑은 고딕" w:hAnsi="맑은 고딕" w:eastAsia="맑은 고딕"/>
+                <w:b w:val="0"/>
+                <w:color w:val="1A1D24"/>
+                <w:sz w:val="19"/>
+              </w:rPr>
+              <w:t>백업 → 빌드 → 마이그레이션 → 재시작 → health 확인</w:t>
+            </w:r>
+          </w:p>
+        </w:tc>
+      </w:tr>
+      <w:tr>
+        <w:tc>
+          <w:tcPr>
+            <w:tcW w:type="dxa" w:w="4824"/>
+          </w:tcPr>
+          <w:p>
+            <w:pPr>
+              <w:spacing w:before="40" w:after="40"/>
+            </w:pPr>
+            <w:r/>
+            <w:r>
+              <w:rPr>
+                <w:rFonts w:ascii="맑은 고딕" w:hAnsi="맑은 고딕" w:eastAsia="맑은 고딕"/>
+                <w:b w:val="0"/>
+                <w:color w:val="1A1D24"/>
+                <w:sz w:val="19"/>
+              </w:rPr>
+              <w:t>백업</w:t>
+            </w:r>
+          </w:p>
+        </w:tc>
+        <w:tc>
+          <w:tcPr>
+            <w:tcW w:type="dxa" w:w="4824"/>
+          </w:tcPr>
+          <w:p>
+            <w:pPr>
+              <w:spacing w:before="40" w:after="40"/>
+            </w:pPr>
+            <w:r/>
+            <w:r>
+              <w:rPr>
+                <w:rFonts w:ascii="맑은 고딕" w:hAnsi="맑은 고딕" w:eastAsia="맑은 고딕"/>
+                <w:b w:val="0"/>
+                <w:color w:val="1A1D24"/>
+                <w:sz w:val="19"/>
+              </w:rPr>
+              <w:t xml:space="preserve">VM 야간 </w:t>
+            </w:r>
+            <w:r>
+              <w:rPr>
+                <w:rFonts w:ascii="Consolas" w:hAnsi="Consolas" w:eastAsia="Consolas"/>
+                <w:b w:val="0"/>
+                <w:color w:val="223355"/>
+                <w:sz w:val="18"/>
+              </w:rPr>
+              <w:t>pg_dump</w:t>
+            </w:r>
+            <w:r>
+              <w:rPr>
+                <w:rFonts w:ascii="맑은 고딕" w:hAnsi="맑은 고딕" w:eastAsia="맑은 고딕"/>
+                <w:b w:val="0"/>
+                <w:color w:val="1A1D24"/>
+                <w:sz w:val="19"/>
+              </w:rPr>
+              <w:t xml:space="preserve"> → 내 PC </w:t>
+            </w:r>
+            <w:r>
+              <w:rPr>
+                <w:rFonts w:ascii="Consolas" w:hAnsi="Consolas" w:eastAsia="Consolas"/>
+                <w:b w:val="0"/>
+                <w:color w:val="223355"/>
+                <w:sz w:val="18"/>
+              </w:rPr>
+              <w:t>D:\vidshare-data\backups</w:t>
+            </w:r>
+            <w:r>
+              <w:rPr>
+                <w:rFonts w:ascii="맑은 고딕" w:hAnsi="맑은 고딕" w:eastAsia="맑은 고딕"/>
+                <w:b w:val="0"/>
+                <w:color w:val="1A1D24"/>
+                <w:sz w:val="19"/>
+              </w:rPr>
+              <w:t xml:space="preserve"> 로 매일 가져옴. 복원 연습까지 확인</w:t>
+            </w:r>
+          </w:p>
+        </w:tc>
+      </w:tr>
+      <w:tr>
+        <w:tc>
+          <w:tcPr>
+            <w:tcW w:type="dxa" w:w="4824"/>
+          </w:tcPr>
+          <w:p>
+            <w:pPr>
+              <w:spacing w:before="40" w:after="40"/>
+            </w:pPr>
+            <w:r/>
+            <w:r>
+              <w:rPr>
+                <w:rFonts w:ascii="맑은 고딕" w:hAnsi="맑은 고딕" w:eastAsia="맑은 고딕"/>
+                <w:b w:val="0"/>
+                <w:color w:val="1A1D24"/>
+                <w:sz w:val="19"/>
+              </w:rPr>
+              <w:t>로컬 DB</w:t>
+            </w:r>
+          </w:p>
+        </w:tc>
+        <w:tc>
+          <w:tcPr>
+            <w:tcW w:type="dxa" w:w="4824"/>
+          </w:tcPr>
+          <w:p>
+            <w:pPr>
+              <w:spacing w:before="40" w:after="40"/>
+            </w:pPr>
+            <w:r/>
+            <w:r>
+              <w:rPr>
+                <w:rFonts w:ascii="맑은 고딕" w:hAnsi="맑은 고딕" w:eastAsia="맑은 고딕"/>
+                <w:b w:val="0"/>
+                <w:color w:val="1A1D24"/>
+                <w:sz w:val="19"/>
+              </w:rPr>
+              <w:t xml:space="preserve">내 PC 의 PostgreSQL 16 (데이터 </w:t>
+            </w:r>
+            <w:r>
+              <w:rPr>
+                <w:rFonts w:ascii="Consolas" w:hAnsi="Consolas" w:eastAsia="Consolas"/>
+                <w:b w:val="0"/>
+                <w:color w:val="223355"/>
+                <w:sz w:val="18"/>
+              </w:rPr>
+              <w:t>D:\PostgreSQL\16\data</w:t>
+            </w:r>
+            <w:r>
+              <w:rPr>
+                <w:rFonts w:ascii="맑은 고딕" w:hAnsi="맑은 고딕" w:eastAsia="맑은 고딕"/>
+                <w:b w:val="0"/>
+                <w:color w:val="1A1D24"/>
+                <w:sz w:val="19"/>
+              </w:rPr>
+              <w:t>)</w:t>
+            </w:r>
+          </w:p>
+        </w:tc>
+      </w:tr>
+    </w:tbl>
+    <w:p>
+      <w:pPr>
+        <w:spacing w:after="80"/>
+      </w:pPr>
+    </w:p>
+    <w:p>
+      <w:r>
+        <w:rPr>
+          <w:rFonts w:ascii="맑은 고딕" w:hAnsi="맑은 고딕" w:eastAsia="맑은 고딕"/>
+          <w:b w:val="0"/>
+          <w:color w:val="1A1D24"/>
+          <w:sz w:val="21"/>
+        </w:rPr>
+        <w:t xml:space="preserve">세 호스트를 </w:t>
+      </w:r>
+      <w:r>
+        <w:rPr>
+          <w:rFonts w:ascii="맑은 고딕" w:hAnsi="맑은 고딕" w:eastAsia="맑은 고딕"/>
+          <w:b/>
+          <w:color w:val="1A1D24"/>
+          <w:sz w:val="21"/>
+        </w:rPr>
+        <w:t>한 도메인 아래</w:t>
+      </w:r>
+      <w:r>
+        <w:rPr>
+          <w:rFonts w:ascii="맑은 고딕" w:hAnsi="맑은 고딕" w:eastAsia="맑은 고딕"/>
+          <w:b w:val="0"/>
+          <w:color w:val="1A1D24"/>
+          <w:sz w:val="21"/>
+        </w:rPr>
+        <w:t xml:space="preserve">에 두는 것이 핵심이다 — 그래야 </w:t>
+      </w:r>
+      <w:r>
+        <w:rPr>
+          <w:rFonts w:ascii="Consolas" w:hAnsi="Consolas" w:eastAsia="Consolas"/>
+          <w:b w:val="0"/>
+          <w:color w:val="223355"/>
+          <w:sz w:val="20"/>
+        </w:rPr>
+        <w:t>SameSite=Lax</w:t>
+      </w:r>
+      <w:r>
+        <w:rPr>
+          <w:rFonts w:ascii="맑은 고딕" w:hAnsi="맑은 고딕" w:eastAsia="맑은 고딕"/>
+          <w:b w:val="0"/>
+          <w:color w:val="1A1D24"/>
+          <w:sz w:val="21"/>
+        </w:rPr>
+        <w:t xml:space="preserve"> 세션 쿠키가 API 요청에 실린다(7.3).</w:t>
+      </w:r>
+    </w:p>
+    <w:p>
+      <w:r>
+        <w:rPr>
+          <w:rFonts w:ascii="맑은 고딕" w:hAnsi="맑은 고딕" w:eastAsia="맑은 고딕"/>
+          <w:b/>
+          <w:color w:val="1A1D24"/>
+          <w:sz w:val="21"/>
+        </w:rPr>
+        <w:t>현재 상태</w:t>
+      </w:r>
+      <w:r>
+        <w:rPr>
+          <w:rFonts w:ascii="맑은 고딕" w:hAnsi="맑은 고딕" w:eastAsia="맑은 고딕"/>
+          <w:b w:val="0"/>
+          <w:color w:val="1A1D24"/>
+          <w:sz w:val="21"/>
+        </w:rPr>
+        <w:t xml:space="preserve">: 프론트 2종은 배포되어 있으나 공개 백엔드가 연결되기 전이라 </w:t>
+      </w:r>
+      <w:r>
+        <w:rPr>
+          <w:rFonts w:ascii="맑은 고딕" w:hAnsi="맑은 고딕" w:eastAsia="맑은 고딕"/>
+          <w:b/>
+          <w:color w:val="1A1D24"/>
+          <w:sz w:val="21"/>
+        </w:rPr>
+        <w:t>UI 확인용</w:t>
+      </w:r>
+      <w:r>
+        <w:rPr>
+          <w:rFonts w:ascii="맑은 고딕" w:hAnsi="맑은 고딕" w:eastAsia="맑은 고딕"/>
+          <w:b w:val="0"/>
+          <w:color w:val="1A1D24"/>
+          <w:sz w:val="21"/>
+        </w:rPr>
+        <w:t>이다. VM 구축과 도메인 연결만 남았고, 전체 기능은 로컬 실행으로 확인할 수 있다.</w:t>
       </w:r>
     </w:p>
     <w:p>
@@ -15945,12 +17095,21 @@
       </w:pPr>
       <w:r>
         <w:rPr>
+          <w:rFonts w:ascii="Consolas" w:hAnsi="Consolas" w:eastAsia="Consolas"/>
+          <w:b/>
+          <w:color w:val="223355"/>
+          <w:sz w:val="20"/>
+        </w:rPr>
+        <w:t>lib/api.ts</w:t>
+      </w:r>
+      <w:r>
+        <w:rPr>
           <w:rFonts w:ascii="맑은 고딕" w:hAnsi="맑은 고딕" w:eastAsia="맑은 고딕"/>
           <w:b/>
           <w:color w:val="1A1D24"/>
           <w:sz w:val="21"/>
         </w:rPr>
-        <w:t>`lib/api.ts` 단일 창구 규약.</w:t>
+        <w:t xml:space="preserve"> 단일 창구 규약.</w:t>
       </w:r>
       <w:r>
         <w:rPr>
@@ -15959,7 +17118,7 @@
           <w:color w:val="1A1D24"/>
           <w:sz w:val="21"/>
         </w:rPr>
-        <w:t xml:space="preserve"> localStorage → SQLite 이관, 크로스 도메인 쿠키 대응 모두 이 규약 덕분에 고칠 지점이 한 곳이었다.</w:t>
+        <w:t xml:space="preserve"> localStorage → SQLite 이관, 크로스 도메인 쿠키 대응 모두 이 규약 덕분에 고칠 지점이 한 곳이었다. 뒤에 DB 를 Postgres 로 바꿀 때 프론트는 한 줄도 바뀌지 않았다.</w:t>
       </w:r>
     </w:p>
     <w:p>
@@ -16033,7 +17192,7 @@
           <w:color w:val="1A1D24"/>
           <w:sz w:val="21"/>
         </w:rPr>
-        <w:t>CI를 마지막까지 미룬 것.</w:t>
+        <w:t>CI를 늦게 깐 것.</w:t>
       </w:r>
       <w:r>
         <w:rPr>
@@ -16042,7 +17201,7 @@
           <w:color w:val="1A1D24"/>
           <w:sz w:val="21"/>
         </w:rPr>
-        <w:t xml:space="preserve"> 테스트는 177건을 만들어 놓고 자동 실행은 수동이다. PR마다 세 앱을 검증하는 파이프라인을 먼저 깔았어야 했다.</w:t>
+        <w:t xml:space="preserve"> 테스트를 170건 넘게 만들어 놓고도 한동안 수동으로 돌렸다. 지금은 GitHub Actions 가 PR마다 세 앱을 검증하지만, 처음부터 깔았어야 했다.</w:t>
       </w:r>
     </w:p>
     <w:p>
@@ -16053,12 +17212,21 @@
       </w:pPr>
       <w:r>
         <w:rPr>
+          <w:rFonts w:ascii="Consolas" w:hAnsi="Consolas" w:eastAsia="Consolas"/>
+          <w:b/>
+          <w:color w:val="223355"/>
+          <w:sz w:val="20"/>
+        </w:rPr>
+        <w:t>data/store.ts</w:t>
+      </w:r>
+      <w:r>
+        <w:rPr>
           <w:rFonts w:ascii="맑은 고딕" w:hAnsi="맑은 고딕" w:eastAsia="맑은 고딕"/>
           <w:b/>
           <w:color w:val="1A1D24"/>
           <w:sz w:val="21"/>
         </w:rPr>
-        <w:t>`data/store.ts` 가 1,500줄이 되도록 방치한 것.</w:t>
+        <w:t xml:space="preserve"> 가 1,500줄이 되도록 방치한 것.</w:t>
       </w:r>
       <w:r>
         <w:rPr>
@@ -16123,7 +17291,7 @@
           <w:color w:val="1A1D24"/>
           <w:sz w:val="21"/>
         </w:rPr>
-        <w:t xml:space="preserve">백엔드 공개 배포 → 프론트 재배포로 </w:t>
+        <w:t xml:space="preserve">Oracle VM 구축 · 도메인 연결 → 프론트 재배포로 </w:t>
       </w:r>
       <w:r>
         <w:rPr>
@@ -16157,7 +17325,16 @@
           <w:color w:val="1A1D24"/>
           <w:sz w:val="21"/>
         </w:rPr>
-        <w:t>CI 파이프라인 (PR마다 3개 앱 typecheck / lint / test)</w:t>
+        <w:t xml:space="preserve">CI 파이프라인 — </w:t>
+      </w:r>
+      <w:r>
+        <w:rPr>
+          <w:rFonts w:ascii="맑은 고딕" w:hAnsi="맑은 고딕" w:eastAsia="맑은 고딕"/>
+          <w:b/>
+          <w:color w:val="1A1D24"/>
+          <w:sz w:val="21"/>
+        </w:rPr>
+        <w:t>완료 (097)</w:t>
       </w:r>
     </w:p>
     <w:p>
@@ -16244,7 +17421,71 @@
           <w:color w:val="223355"/>
           <w:sz w:val="20"/>
         </w:rPr>
-        <w:t># 1. 백엔드</w:t>
+        <w:t># 0. DB (최초 1회) — 내 PC 의 PostgreSQL 16 에 vidshare 계정·DB</w:t>
+      </w:r>
+    </w:p>
+    <w:p>
+      <w:pPr>
+        <w:spacing w:before="0" w:after="0"/>
+        <w:ind w:left="259"/>
+        <w:shd w:val="clear" w:fill="F4F5F8"/>
+      </w:pPr>
+      <w:r>
+        <w:rPr>
+          <w:rFonts w:ascii="Consolas" w:hAnsi="Consolas" w:eastAsia="Consolas"/>
+          <w:b w:val="0"/>
+          <w:color w:val="223355"/>
+          <w:sz w:val="20"/>
+        </w:rPr>
+        <w:t>powershell -ExecutionPolicy Bypass -File deploy\windows\setup-postgres-d.ps1</w:t>
+      </w:r>
+    </w:p>
+    <w:p>
+      <w:pPr>
+        <w:spacing w:before="0" w:after="0"/>
+        <w:ind w:left="259"/>
+        <w:shd w:val="clear" w:fill="F4F5F8"/>
+      </w:pPr>
+      <w:r>
+        <w:rPr>
+          <w:rFonts w:ascii="Consolas" w:hAnsi="Consolas" w:eastAsia="Consolas"/>
+          <w:b w:val="0"/>
+          <w:color w:val="223355"/>
+          <w:sz w:val="20"/>
+        </w:rPr>
+        <w:t>#    출력된 DATABASE_URL / DATABASE_URL_TEST / UPLOADS_PATH 를 BackendServer/.env 에</w:t>
+      </w:r>
+    </w:p>
+    <w:p>
+      <w:pPr>
+        <w:spacing w:before="0" w:after="0"/>
+        <w:ind w:left="259"/>
+        <w:shd w:val="clear" w:fill="F4F5F8"/>
+      </w:pPr>
+      <w:r>
+        <w:rPr>
+          <w:rFonts w:ascii="Consolas" w:hAnsi="Consolas" w:eastAsia="Consolas"/>
+          <w:b w:val="0"/>
+          <w:color w:val="223355"/>
+          <w:sz w:val="20"/>
+        </w:rPr>
+        <w:t xml:space="preserve"> </w:t>
+      </w:r>
+    </w:p>
+    <w:p>
+      <w:pPr>
+        <w:spacing w:before="0" w:after="0"/>
+        <w:ind w:left="259"/>
+        <w:shd w:val="clear" w:fill="F4F5F8"/>
+      </w:pPr>
+      <w:r>
+        <w:rPr>
+          <w:rFonts w:ascii="Consolas" w:hAnsi="Consolas" w:eastAsia="Consolas"/>
+          <w:b w:val="0"/>
+          <w:color w:val="223355"/>
+          <w:sz w:val="20"/>
+        </w:rPr>
+        <w:t># 1. 백엔드 (시작 시 마이그레이션 자동 적용)</w:t>
       </w:r>
     </w:p>
     <w:p>

</xml_diff>